<commit_message>
feat(assessment): enrich Part II with authentic scientific contexts >=25 words and prioritize core curriculum knowledge for Part I
</commit_message>
<xml_diff>
--- a/exports/qa-package/01_Ma_tran_KHTN8.docx
+++ b/exports/qa-package/01_Ma_tran_KHTN8.docx
@@ -28,7 +28,7 @@
           <w:szCs w:val="28"/>
         </w:rPr>
         <w:t xml:space="preserve">
-MA TRẬN ĐỀ KIỂM TRA ĐỊNH KÌ
+MA TRẬN ĐỀ KIỂM TRA GIỮA HK1
 </w:t>
       </w:r>
       <w:r>
@@ -969,27 +969,27 @@
                 <w:sz w:val="18"/>
                 <w:szCs w:val="18"/>
               </w:rPr>
-              <w:t xml:space="preserve">2</w:t>
-            </w:r>
-          </w:p>
-        </w:tc>
-        <w:tc>
-          <w:tcPr>
-            <w:tcW w:type="dxa" w:w="800"/>
-          </w:tcPr>
-          <w:p>
-            <w:pPr>
-              <w:jc w:val="center"/>
-            </w:pPr>
-            <w:r>
-              <w:rPr>
-                <w:rFonts w:ascii="Times New Roman" w:cs="Times New Roman" w:eastAsia="Times New Roman" w:hAnsi="Times New Roman"/>
-                <w:b w:val="false"/>
-                <w:bCs w:val="false"/>
-                <w:sz w:val="18"/>
-                <w:szCs w:val="18"/>
-              </w:rPr>
-              <w:t xml:space="preserve">2</w:t>
+              <w:t xml:space="preserve">3</w:t>
+            </w:r>
+          </w:p>
+        </w:tc>
+        <w:tc>
+          <w:tcPr>
+            <w:tcW w:type="dxa" w:w="800"/>
+          </w:tcPr>
+          <w:p>
+            <w:pPr>
+              <w:jc w:val="center"/>
+            </w:pPr>
+            <w:r>
+              <w:rPr>
+                <w:rFonts w:ascii="Times New Roman" w:cs="Times New Roman" w:eastAsia="Times New Roman" w:hAnsi="Times New Roman"/>
+                <w:b w:val="false"/>
+                <w:bCs w:val="false"/>
+                <w:sz w:val="18"/>
+                <w:szCs w:val="18"/>
+              </w:rPr>
+              <w:t xml:space="preserve">1</w:t>
             </w:r>
           </w:p>
         </w:tc>
@@ -1171,27 +1171,27 @@
                 <w:sz w:val="18"/>
                 <w:szCs w:val="18"/>
               </w:rPr>
-              <w:t xml:space="preserve">2</w:t>
-            </w:r>
-          </w:p>
-        </w:tc>
-        <w:tc>
-          <w:tcPr>
-            <w:tcW w:type="dxa" w:w="800"/>
-          </w:tcPr>
-          <w:p>
-            <w:pPr>
-              <w:jc w:val="center"/>
-            </w:pPr>
-            <w:r>
-              <w:rPr>
-                <w:rFonts w:ascii="Times New Roman" w:cs="Times New Roman" w:eastAsia="Times New Roman" w:hAnsi="Times New Roman"/>
-                <w:b w:val="false"/>
-                <w:bCs w:val="false"/>
-                <w:sz w:val="18"/>
-                <w:szCs w:val="18"/>
-              </w:rPr>
-              <w:t xml:space="preserve">2</w:t>
+              <w:t xml:space="preserve">3</w:t>
+            </w:r>
+          </w:p>
+        </w:tc>
+        <w:tc>
+          <w:tcPr>
+            <w:tcW w:type="dxa" w:w="800"/>
+          </w:tcPr>
+          <w:p>
+            <w:pPr>
+              <w:jc w:val="center"/>
+            </w:pPr>
+            <w:r>
+              <w:rPr>
+                <w:rFonts w:ascii="Times New Roman" w:cs="Times New Roman" w:eastAsia="Times New Roman" w:hAnsi="Times New Roman"/>
+                <w:b w:val="false"/>
+                <w:bCs w:val="false"/>
+                <w:sz w:val="18"/>
+                <w:szCs w:val="18"/>
+              </w:rPr>
+              <w:t xml:space="preserve">1</w:t>
             </w:r>
           </w:p>
         </w:tc>
@@ -1373,27 +1373,27 @@
                 <w:sz w:val="18"/>
                 <w:szCs w:val="18"/>
               </w:rPr>
-              <w:t xml:space="preserve">2</w:t>
-            </w:r>
-          </w:p>
-        </w:tc>
-        <w:tc>
-          <w:tcPr>
-            <w:tcW w:type="dxa" w:w="800"/>
-          </w:tcPr>
-          <w:p>
-            <w:pPr>
-              <w:jc w:val="center"/>
-            </w:pPr>
-            <w:r>
-              <w:rPr>
-                <w:rFonts w:ascii="Times New Roman" w:cs="Times New Roman" w:eastAsia="Times New Roman" w:hAnsi="Times New Roman"/>
-                <w:b w:val="false"/>
-                <w:bCs w:val="false"/>
-                <w:sz w:val="18"/>
-                <w:szCs w:val="18"/>
-              </w:rPr>
-              <w:t xml:space="preserve">1</w:t>
+              <w:t xml:space="preserve">3</w:t>
+            </w:r>
+          </w:p>
+        </w:tc>
+        <w:tc>
+          <w:tcPr>
+            <w:tcW w:type="dxa" w:w="800"/>
+          </w:tcPr>
+          <w:p>
+            <w:pPr>
+              <w:jc w:val="center"/>
+            </w:pPr>
+            <w:r>
+              <w:rPr>
+                <w:rFonts w:ascii="Times New Roman" w:cs="Times New Roman" w:eastAsia="Times New Roman" w:hAnsi="Times New Roman"/>
+                <w:b w:val="false"/>
+                <w:bCs w:val="false"/>
+                <w:sz w:val="18"/>
+                <w:szCs w:val="18"/>
+              </w:rPr>
+              <w:t xml:space="preserve">-</w:t>
             </w:r>
           </w:p>
         </w:tc>
@@ -1535,27 +1535,27 @@
                 <w:sz w:val="18"/>
                 <w:szCs w:val="18"/>
               </w:rPr>
-              <w:t xml:space="preserve">11</w:t>
-            </w:r>
-          </w:p>
-        </w:tc>
-        <w:tc>
-          <w:tcPr>
-            <w:tcW w:type="dxa" w:w="800"/>
-          </w:tcPr>
-          <w:p>
-            <w:pPr>
-              <w:jc w:val="center"/>
-            </w:pPr>
-            <w:r>
-              <w:rPr>
-                <w:rFonts w:ascii="Times New Roman" w:cs="Times New Roman" w:eastAsia="Times New Roman" w:hAnsi="Times New Roman"/>
-                <w:b/>
-                <w:bCs/>
-                <w:sz w:val="18"/>
-                <w:szCs w:val="18"/>
-              </w:rPr>
-              <w:t xml:space="preserve">5</w:t>
+              <w:t xml:space="preserve">14</w:t>
+            </w:r>
+          </w:p>
+        </w:tc>
+        <w:tc>
+          <w:tcPr>
+            <w:tcW w:type="dxa" w:w="800"/>
+          </w:tcPr>
+          <w:p>
+            <w:pPr>
+              <w:jc w:val="center"/>
+            </w:pPr>
+            <w:r>
+              <w:rPr>
+                <w:rFonts w:ascii="Times New Roman" w:cs="Times New Roman" w:eastAsia="Times New Roman" w:hAnsi="Times New Roman"/>
+                <w:b/>
+                <w:bCs/>
+                <w:sz w:val="18"/>
+                <w:szCs w:val="18"/>
+              </w:rPr>
+              <w:t xml:space="preserve">2</w:t>
             </w:r>
           </w:p>
         </w:tc>

</xml_diff>

<commit_message>
fix(export-engine): resolve corrupted word docx files by eliminating raw newlines in XML text runs
</commit_message>
<xml_diff>
--- a/exports/qa-package/01_Ma_tran_KHTN8.docx
+++ b/exports/qa-package/01_Ma_tran_KHTN8.docx
@@ -4,6 +4,7 @@
   <w:body>
     <w:p>
       <w:pPr>
+        <w:spacing w:after="20" w:before="0"/>
         <w:jc w:val="center"/>
       </w:pPr>
       <w:r>
@@ -14,10 +15,30 @@
           <w:sz w:val="22"/>
           <w:szCs w:val="22"/>
         </w:rPr>
-        <w:t xml:space="preserve">TRƯỜNG THCS &amp; THPT PHAN VĂN TRỊ
-TỔ KHOA HỌC TỰ NHIÊN
-</w:t>
+        <w:t xml:space="preserve">TRƯỜNG THCS &amp; THPT PHAN VĂN TRỊ</w:t>
       </w:r>
+    </w:p>
+    <w:p>
+      <w:pPr>
+        <w:spacing w:after="120"/>
+        <w:jc w:val="center"/>
+      </w:pPr>
+      <w:r>
+        <w:rPr>
+          <w:rFonts w:ascii="Times New Roman" w:cs="Times New Roman" w:eastAsia="Times New Roman" w:hAnsi="Times New Roman"/>
+          <w:b/>
+          <w:bCs/>
+          <w:sz w:val="22"/>
+          <w:szCs w:val="22"/>
+        </w:rPr>
+        <w:t xml:space="preserve">TỔ KHOA HỌC TỰ NHIÊN</w:t>
+      </w:r>
+    </w:p>
+    <w:p>
+      <w:pPr>
+        <w:spacing w:after="60" w:before="60"/>
+        <w:jc w:val="center"/>
+      </w:pPr>
       <w:r>
         <w:rPr>
           <w:rFonts w:ascii="Times New Roman" w:cs="Times New Roman" w:eastAsia="Times New Roman" w:hAnsi="Times New Roman"/>
@@ -27,10 +48,14 @@
           <w:sz w:val="28"/>
           <w:szCs w:val="28"/>
         </w:rPr>
-        <w:t xml:space="preserve">
-MA TRẬN ĐỀ KIỂM TRA GIỮA HK1
-</w:t>
+        <w:t xml:space="preserve">MA TRẬN ĐỀ KIỂM TRA GIỮA HK1</w:t>
       </w:r>
+    </w:p>
+    <w:p>
+      <w:pPr>
+        <w:spacing w:after="200"/>
+        <w:jc w:val="center"/>
+      </w:pPr>
       <w:r>
         <w:rPr>
           <w:rFonts w:ascii="Times New Roman" w:cs="Times New Roman" w:eastAsia="Times New Roman" w:hAnsi="Times New Roman"/>

</xml_diff>